<commit_message>
Clean default CV, page header, and unbreakable entries
The full CV no longer flags anything; NEW tags are an opt-in review copy
(mark=tag). Drop the divider style. Add a little space between references,
keep every entry whole on one page in PDF and Word, and add a running
header with name and "Page n / total" from page 2. Build the Word styles
from cv-style/make-reference-docx.py so the header and styles are
reproducible.

Co-Authored-By: Claude Sonnet 5.5 <noreply@anthropic.com>
Claude-Session: https://claude.ai/code/session_01QkyJVjkfZtCKiLbUoFmXnW
</commit_message>
<xml_diff>
--- a/cv-style/reference.docx
+++ b/cv-style/reference.docx
@@ -383,7 +383,11 @@
       </w:r>
     </w:p>
     <w:sectPr>
+      <w:headerReference w:type="default" r:id="rId9"/>
+      <w:headerReference w:type="first" r:id="rId10"/>
+      <w:pgSz w:w="12240" w:h="15840"/>
       <w:pgMar w:left="1296" w:right="1296" w:top="1152" w:bottom="1152"/>
+      <w:titlePg/>
     </w:sectPr>
   </w:body>
 </w:document>
@@ -429,6 +433,70 @@
     </w:p>
   </w:footnote>
 </w:footnotes>
+</file>
+
+<file path=word/header1.xml><?xml version="1.0" encoding="utf-8"?>
+<w:hdr xmlns:m="http://schemas.openxmlformats.org/officeDocument/2006/math" xmlns:mc="http://schemas.openxmlformats.org/markup-compatibility/2006" xmlns:mo="http://schemas.microsoft.com/office/mac/office/2008/main" xmlns:mv="urn:schemas-microsoft-com:mac:vml" xmlns:o="urn:schemas-microsoft-com:office:office" xmlns:r="http://schemas.openxmlformats.org/officeDocument/2006/relationships" xmlns:v="urn:schemas-microsoft-com:vml" xmlns:w10="urn:schemas-microsoft-com:office:word" xmlns:w14="http://schemas.microsoft.com/office/word/2010/wordml" xmlns:w="http://schemas.openxmlformats.org/wordprocessingml/2006/main" xmlns:wne="http://schemas.microsoft.com/office/word/2006/wordml" xmlns:wp14="http://schemas.microsoft.com/office/word/2010/wordprocessingDrawing" xmlns:wp="http://schemas.openxmlformats.org/drawingml/2006/wordprocessingDrawing" xmlns:wpc="http://schemas.microsoft.com/office/word/2010/wordprocessingCanvas" xmlns:wpg="http://schemas.microsoft.com/office/word/2010/wordprocessingGroup" xmlns:wpi="http://schemas.microsoft.com/office/word/2010/wordprocessingInk" xmlns:wps="http://schemas.microsoft.com/office/word/2010/wordprocessingShape" mc:Ignorable="w14 wp14">
+  <w:p>
+    <w:pPr>
+      <w:pBdr>
+        <w:bottom w:val="single" w:sz="4" w:space="1" w:color="777777"/>
+      </w:pBdr>
+      <w:pStyle w:val="Header"/>
+      <w:tabs>
+        <w:tab w:pos="9648" w:val="right"/>
+      </w:tabs>
+    </w:pPr>
+    <w:r>
+      <w:rPr>
+        <w:rFonts w:ascii="Georgia" w:hAnsi="Georgia"/>
+        <w:sz w:val="18"/>
+      </w:rPr>
+      <w:t>Jarad B. Niemi</w:t>
+      <w:tab/>
+      <w:t xml:space="preserve">Page </w:t>
+    </w:r>
+    <w:r>
+      <w:rPr>
+        <w:rFonts w:ascii="Georgia" w:hAnsi="Georgia"/>
+        <w:sz w:val="18"/>
+      </w:rPr>
+      <w:fldChar w:fldCharType="begin"/>
+      <w:instrText xml:space="preserve"> PAGE </w:instrText>
+      <w:fldChar w:fldCharType="separate"/>
+      <w:t>1</w:t>
+      <w:fldChar w:fldCharType="end"/>
+    </w:r>
+    <w:r>
+      <w:rPr>
+        <w:rFonts w:ascii="Georgia" w:hAnsi="Georgia"/>
+        <w:sz w:val="18"/>
+      </w:rPr>
+      <w:t xml:space="preserve"> / </w:t>
+    </w:r>
+    <w:r>
+      <w:rPr>
+        <w:rFonts w:ascii="Georgia" w:hAnsi="Georgia"/>
+        <w:sz w:val="18"/>
+      </w:rPr>
+      <w:fldChar w:fldCharType="begin"/>
+      <w:instrText xml:space="preserve"> NUMPAGES </w:instrText>
+      <w:fldChar w:fldCharType="separate"/>
+      <w:t>1</w:t>
+      <w:fldChar w:fldCharType="end"/>
+    </w:r>
+  </w:p>
+</w:hdr>
+</file>
+
+<file path=word/header2.xml><?xml version="1.0" encoding="utf-8"?>
+<w:hdr xmlns:m="http://schemas.openxmlformats.org/officeDocument/2006/math" xmlns:mc="http://schemas.openxmlformats.org/markup-compatibility/2006" xmlns:mo="http://schemas.microsoft.com/office/mac/office/2008/main" xmlns:mv="urn:schemas-microsoft-com:mac:vml" xmlns:o="urn:schemas-microsoft-com:office:office" xmlns:r="http://schemas.openxmlformats.org/officeDocument/2006/relationships" xmlns:v="urn:schemas-microsoft-com:vml" xmlns:w10="urn:schemas-microsoft-com:office:word" xmlns:w14="http://schemas.microsoft.com/office/word/2010/wordml" xmlns:w="http://schemas.openxmlformats.org/wordprocessingml/2006/main" xmlns:wne="http://schemas.microsoft.com/office/word/2006/wordml" xmlns:wp14="http://schemas.microsoft.com/office/word/2010/wordprocessingDrawing" xmlns:wp="http://schemas.openxmlformats.org/drawingml/2006/wordprocessingDrawing" xmlns:wpc="http://schemas.microsoft.com/office/word/2010/wordprocessingCanvas" xmlns:wpg="http://schemas.microsoft.com/office/word/2010/wordprocessingGroup" xmlns:wpi="http://schemas.microsoft.com/office/word/2010/wordprocessingInk" xmlns:wps="http://schemas.microsoft.com/office/word/2010/wordprocessingShape" mc:Ignorable="w14 wp14">
+  <w:p>
+    <w:pPr>
+      <w:pStyle w:val="Header"/>
+    </w:pPr>
+  </w:p>
+</w:hdr>
 </file>
 
 <file path=word/numbering.xml><?xml version="1.0" encoding="utf-8"?>
@@ -564,7 +632,7 @@
     <w:name w:val="Normal"/>
     <w:qFormat/>
     <w:pPr>
-      <w:spacing w:after="60" w:before="0"/>
+      <w:spacing w:before="0" w:after="60"/>
     </w:pPr>
     <w:rPr>
       <w:rFonts w:ascii="Georgia" w:hAnsi="Georgia" w:cs="Georgia" w:eastAsia="Georgia"/>
@@ -592,7 +660,7 @@
     <w:next w:val="BodyText"/>
     <w:qFormat/>
     <w:pPr>
-      <w:spacing w:after="60" w:before="0"/>
+      <w:spacing w:before="0" w:after="60"/>
     </w:pPr>
     <w:rPr>
       <w:rFonts w:ascii="Georgia" w:hAnsi="Georgia" w:cs="Georgia" w:eastAsia="Georgia"/>
@@ -605,6 +673,7 @@
     <w:basedOn w:val="BodyText"/>
     <w:qFormat/>
     <w:pPr>
+      <w:keepLines/>
       <w:spacing w:before="0" w:after="60"/>
     </w:pPr>
     <w:rPr>
@@ -718,13 +787,13 @@
     <w:uiPriority w:val="9"/>
     <w:qFormat/>
     <w:pPr>
-      <w:keepNext/>
-      <w:keepLines/>
-      <w:spacing w:before="0" w:after="120"/>
-      <w:outlineLvl w:val="0"/>
       <w:pBdr>
         <w:bottom w:val="single" w:sz="8" w:space="1" w:color="000000"/>
       </w:pBdr>
+      <w:keepNext/>
+      <w:keepLines/>
+      <w:spacing w:before="0" w:after="120"/>
+      <w:outlineLvl w:val="0"/>
     </w:pPr>
     <w:rPr>
       <w:rFonts w:ascii="Georgia" w:hAnsi="Georgia" w:cs="Georgia" w:eastAsia="Georgia"/>
@@ -743,13 +812,13 @@
     <w:unhideWhenUsed/>
     <w:qFormat/>
     <w:pPr>
-      <w:keepNext/>
-      <w:keepLines/>
-      <w:spacing w:before="280" w:after="100"/>
-      <w:outlineLvl w:val="1"/>
       <w:pBdr>
         <w:bottom w:val="single" w:sz="4" w:space="1" w:color="000000"/>
       </w:pBdr>
+      <w:keepNext/>
+      <w:keepLines/>
+      <w:spacing w:before="280" w:after="100"/>
+      <w:outlineLvl w:val="1"/>
     </w:pPr>
     <w:rPr>
       <w:rFonts w:ascii="Georgia" w:hAnsi="Georgia" w:cs="Georgia" w:eastAsia="Georgia"/>
@@ -1066,19 +1135,20 @@
     <w:name w:val="CV Entry"/>
     <w:basedOn w:val="Normal"/>
     <w:pPr>
-      <w:spacing w:after="100"/>
+      <w:keepLines/>
+      <w:spacing w:after="140"/>
       <w:ind w:left="288" w:hanging="288"/>
     </w:pPr>
   </w:style>
-  <w:style w:type="paragraph" w:customStyle="1" w:styleId="CVDivider">
-    <w:name w:val="CV Divider"/>
-    <w:basedOn w:val="Normal"/>
-    <w:pPr>
-      <w:jc w:val="center"/>
-    </w:pPr>
-    <w:rPr>
-      <w:i/>
-      <w:sz w:val="18"/>
+  <w:style w:type="paragraph" w:customStyle="1" w:styleId="CVGroup">
+    <w:name w:val="CV Group"/>
+    <w:basedOn w:val="Normal"/>
+    <w:pPr>
+      <w:keepNext/>
+      <w:spacing w:before="120"/>
+    </w:pPr>
+    <w:rPr>
+      <w:b/>
     </w:rPr>
   </w:style>
   <w:style w:type="character" w:customStyle="1" w:styleId="CVNew">

</xml_diff>

<commit_message>
Port every remaining section to the Quarto CV and explain the advisee star
Employment, the publication lists that were still written out in LaTeX,
posters, news, courses, grants, honors, memberships, service and the student
tables now render to PDF, Word and HTML from the CSVs. The six hand-written
publication lists (book chapters, proceedings, abstracts, book reviews,
patents, other manuscripts) move into publications.csv under new types with a
`details` column, and a Matt Simpson alias keeps his star.

Sections with starred bylines say what the star means. Service lists keep
each bullet whole, short tables stay on one page (Word via keep-tables.py)
and long ones repeat their header. Submitted and in-preparation work is
opt-in, as in the LaTeX build.

Co-Authored-By: Claude Sonnet 5.5 <noreply@anthropic.com>
Claude-Session: https://claude.ai/code/session_01QkyJVjkfZtCKiLbUoFmXnW
</commit_message>
<xml_diff>
--- a/cv-style/reference.docx
+++ b/cv-style/reference.docx
@@ -1149,6 +1149,19 @@
     </w:pPr>
     <w:rPr>
       <w:b/>
+    </w:rPr>
+  </w:style>
+  <w:style w:type="character" w:customStyle="1" w:styleId="CVTableText">
+    <w:name w:val="CV Table Text"/>
+    <w:rPr>
+      <w:sz w:val="18"/>
+    </w:rPr>
+  </w:style>
+  <w:style w:type="character" w:customStyle="1" w:styleId="CVTableHead">
+    <w:name w:val="CV Table Head"/>
+    <w:rPr>
+      <w:b/>
+      <w:sz w:val="18"/>
     </w:rPr>
   </w:style>
   <w:style w:type="character" w:customStyle="1" w:styleId="CVNew">

</xml_diff>